<commit_message>
fix: Word dosyasının bozulmasına neden olan XML şema hatası giderildi
</commit_message>
<xml_diff>
--- a/Tarim_ve_Su_Kotasi_Karar_Destek_Raporu.docx
+++ b/Tarim_ve_Su_Kotasi_Karar_Destek_Raporu.docx
@@ -63,15 +63,12 @@
     <w:p>
       <w:pPr>
         <w:spacing w:before="240" w:after="120"/>
-        <w:pBdr>
-          <w:left w:val="single" w:sz="24" w:space="8" w:color="3B82F6"/>
-        </w:pBdr>
       </w:pPr>
       <w:r>
         <w:rPr>
           <w:rFonts w:ascii="Arial" w:hAnsi="Arial"/>
           <w:b/>
-          <w:color w:val="1F2937"/>
+          <w:color w:val="2563EB"/>
           <w:sz w:val="26"/>
         </w:rPr>
         <w:t>BÖLÜM 1: YÖNETİCİ ÖZETİ (EXECUTIVE SUMMARY)</w:t>
@@ -122,15 +119,12 @@
     <w:p>
       <w:pPr>
         <w:spacing w:before="360" w:after="120"/>
-        <w:pBdr>
-          <w:left w:val="single" w:sz="24" w:space="8" w:color="3B82F6"/>
-        </w:pBdr>
       </w:pPr>
       <w:r>
         <w:rPr>
           <w:rFonts w:ascii="Arial" w:hAnsi="Arial"/>
           <w:b/>
-          <w:color w:val="1F2937"/>
+          <w:color w:val="2563EB"/>
           <w:sz w:val="26"/>
         </w:rPr>
         <w:t>BÖLÜM 2: KARAR VERİCİ ENSTRÜMANLARI VE DIŞSAL DEĞİŞKENLER</w:t>
@@ -416,15 +410,12 @@
     <w:p>
       <w:pPr>
         <w:spacing w:before="360" w:after="120"/>
-        <w:pBdr>
-          <w:left w:val="single" w:sz="24" w:space="8" w:color="3B82F6"/>
-        </w:pBdr>
       </w:pPr>
       <w:r>
         <w:rPr>
           <w:rFonts w:ascii="Arial" w:hAnsi="Arial"/>
           <w:b/>
-          <w:color w:val="1F2937"/>
+          <w:color w:val="2563EB"/>
           <w:sz w:val="26"/>
         </w:rPr>
         <w:t>BÖLÜM 3: SİMÜLASYON MATEMATİKSEL ALTYAPISI VE PROJEKSİYON DENKLEMLERİ</w:t>
@@ -1019,15 +1010,12 @@
     <w:p>
       <w:pPr>
         <w:spacing w:before="360" w:after="120"/>
-        <w:pBdr>
-          <w:left w:val="single" w:sz="24" w:space="8" w:color="3B82F6"/>
-        </w:pBdr>
       </w:pPr>
       <w:r>
         <w:rPr>
           <w:rFonts w:ascii="Arial" w:hAnsi="Arial"/>
           <w:b/>
-          <w:color w:val="1F2937"/>
+          <w:color w:val="2563EB"/>
           <w:sz w:val="26"/>
         </w:rPr>
         <w:t>BÖLÜM 4: ÇOK DEĞİŞKENLİ KRİZ SENARYOLARI VE DUYARLILIK ANALİZİ</w:t>
@@ -1498,15 +1486,12 @@
     <w:p>
       <w:pPr>
         <w:spacing w:before="360" w:after="120"/>
-        <w:pBdr>
-          <w:left w:val="single" w:sz="24" w:space="8" w:color="3B82F6"/>
-        </w:pBdr>
       </w:pPr>
       <w:r>
         <w:rPr>
           <w:rFonts w:ascii="Arial" w:hAnsi="Arial"/>
           <w:b/>
-          <w:color w:val="1F2937"/>
+          <w:color w:val="2563EB"/>
           <w:sz w:val="26"/>
         </w:rPr>
         <w:t>BÖLÜM 5: GÖRSEL GÖSTERGELERİN BASİTLEŞTİRİLMİŞ AÇIKLAMASI (5 YAŞ KURALI)</w:t>
@@ -1724,15 +1709,12 @@
     <w:p>
       <w:pPr>
         <w:spacing w:before="360" w:after="120"/>
-        <w:pBdr>
-          <w:left w:val="single" w:sz="24" w:space="8" w:color="3B82F6"/>
-        </w:pBdr>
       </w:pPr>
       <w:r>
         <w:rPr>
           <w:rFonts w:ascii="Arial" w:hAnsi="Arial"/>
           <w:b/>
-          <w:color w:val="1F2937"/>
+          <w:color w:val="2563EB"/>
           <w:sz w:val="26"/>
         </w:rPr>
         <w:t>BÖLÜM 6: ÇİFT KATMANLI YAZILIM MİMARİSİ (TECHNICAL TWIN)</w:t>
@@ -1811,15 +1793,12 @@
     <w:p>
       <w:pPr>
         <w:spacing w:before="360" w:after="120"/>
-        <w:pBdr>
-          <w:left w:val="single" w:sz="24" w:space="8" w:color="3B82F6"/>
-        </w:pBdr>
       </w:pPr>
       <w:r>
         <w:rPr>
           <w:rFonts w:ascii="Arial" w:hAnsi="Arial"/>
           <w:b/>
-          <w:color w:val="1F2937"/>
+          <w:color w:val="2563EB"/>
           <w:sz w:val="26"/>
         </w:rPr>
         <w:t>BÖLÜM 7: POLİTİKA TEKLİFLERİ VE İDARİ TALEP METNİ</w:t>
@@ -1884,15 +1863,12 @@
     <w:p>
       <w:pPr>
         <w:spacing w:before="360" w:after="120"/>
-        <w:pBdr>
-          <w:left w:val="single" w:sz="24" w:space="8" w:color="3B82F6"/>
-        </w:pBdr>
       </w:pPr>
       <w:r>
         <w:rPr>
           <w:rFonts w:ascii="Arial" w:hAnsi="Arial"/>
           <w:b/>
-          <w:color w:val="1F2937"/>
+          <w:color w:val="2563EB"/>
           <w:sz w:val="26"/>
         </w:rPr>
         <w:t>BÖLÜM 8: AKADEMİK REFERANSLAR</w:t>

</xml_diff>